<commit_message>
Add corrected preprocessing run (v2): EfficientNetB0 improves from 50% to 73.6%
</commit_message>
<xml_diff>
--- a/reports/BLDC_Project_Full_Report.docx
+++ b/reports/BLDC_Project_Full_Report.docx
@@ -372,6 +372,29 @@
           </w:tcPr>
           <w:p>
             <w:r>
+              <w:t xml:space="preserve">Web dashboard</w:t>
+            </w:r>
+          </w:p>
+        </w:tc>
+        <w:tc>
+          <w:tcPr>
+            <w:tcW w:type="dxa" w:w="6860"/>
+          </w:tcPr>
+          <w:p>
+            <w:r>
+              <w:t xml:space="preserve">Flask, Chart.js</w:t>
+            </w:r>
+          </w:p>
+        </w:tc>
+      </w:tr>
+      <w:tr>
+        <w:tc>
+          <w:tcPr>
+            <w:tcW w:type="dxa" w:w="2500"/>
+            <w:shd w:fill="F2F2F2" w:color="auto" w:val="clear"/>
+          </w:tcPr>
+          <w:p>
+            <w:r>
               <w:t xml:space="preserve">Environment</w:t>
             </w:r>
           </w:p>
@@ -379,6 +402,7 @@
         <w:tc>
           <w:tcPr>
             <w:tcW w:type="dxa" w:w="6860"/>
+            <w:shd w:fill="F2F2F2" w:color="auto" w:val="clear"/>
           </w:tcPr>
           <w:p>
             <w:r>
@@ -391,7 +415,6 @@
         <w:tc>
           <w:tcPr>
             <w:tcW w:type="dxa" w:w="2500"/>
-            <w:shd w:fill="F2F2F2" w:color="auto" w:val="clear"/>
           </w:tcPr>
           <w:p>
             <w:r>
@@ -402,7 +425,6 @@
         <w:tc>
           <w:tcPr>
             <w:tcW w:type="dxa" w:w="6860"/>
-            <w:shd w:fill="F2F2F2" w:color="auto" w:val="clear"/>
           </w:tcPr>
           <w:p>
             <w:r>
@@ -520,7 +542,7 @@
         <w:spacing w:after="160"/>
       </w:pPr>
       <w:r>
-        <w:t xml:space="preserve">The final comparison loops over all 3 fault conditions and all 8 architectures (24 total training runs), automatically logging every result to a results_summary.csv file.</w:t>
+        <w:t xml:space="preserve">The comparison loops over all 3 fault conditions and all 8 architectures (24 total training runs), automatically logging every result to a CSV file. This was run twice: once with the reference implementation's preprocessing approach, and again with a correction applied (Section 6.4).</w:t>
       </w:r>
     </w:p>
     <w:p>
@@ -534,10 +556,19 @@
     </w:p>
     <w:p>
       <w:pPr>
+        <w:pStyle w:val="Heading2"/>
+        <w:spacing w:after="150" w:before="300"/>
+      </w:pPr>
+      <w:r>
+        <w:t xml:space="preserve">6.1 Run 1 (Original)</w:t>
+      </w:r>
+    </w:p>
+    <w:p>
+      <w:pPr>
         <w:spacing w:after="160"/>
       </w:pPr>
       <w:r>
-        <w:t xml:space="preserve">Test accuracy (%) per model per condition:</w:t>
+        <w:t xml:space="preserve">Test accuracy (%) per model per condition, using MobileNet-specific preprocessing for all 8 models (inherited from the reference implementation):</w:t>
       </w:r>
     </w:p>
     <w:tbl>
@@ -1088,6 +1119,747 @@
     </w:p>
     <w:p>
       <w:pPr>
+        <w:spacing w:after="40" w:before="120"/>
+        <w:jc w:val="center"/>
+      </w:pPr>
+      <w:r>
+        <w:drawing>
+          <wp:inline distT="0" distB="0" distL="0" distR="0">
+            <wp:extent cx="4191000" cy="2333625"/>
+            <wp:effectExtent t="0" r="0" b="0" l="0"/>
+            <wp:docPr id="1" name="" descr="" title=""/>
+            <wp:cNvGraphicFramePr>
+              <a:graphicFrameLocks xmlns:a="http://schemas.openxmlformats.org/drawingml/2006/main" noChangeAspect="1"/>
+            </wp:cNvGraphicFramePr>
+            <a:graphic xmlns:a="http://schemas.openxmlformats.org/drawingml/2006/main">
+              <a:graphicData uri="http://schemas.openxmlformats.org/drawingml/2006/picture">
+                <pic:pic xmlns:pic="http://schemas.openxmlformats.org/drawingml/2006/picture">
+                  <pic:nvPicPr>
+                    <pic:cNvPr id="0" name="" descr=""/>
+                    <pic:cNvPicPr>
+                      <a:picLocks noChangeAspect="1" noChangeArrowheads="1"/>
+                    </pic:cNvPicPr>
+                  </pic:nvPicPr>
+                  <pic:blipFill>
+                    <a:blip r:embed="rId7" cstate="none"/>
+                    <a:srcRect/>
+                    <a:stretch>
+                      <a:fillRect/>
+                    </a:stretch>
+                  </pic:blipFill>
+                  <pic:spPr bwMode="auto">
+                    <a:xfrm>
+                      <a:off x="0" y="0"/>
+                      <a:ext cx="4191000" cy="2333625"/>
+                    </a:xfrm>
+                    <a:prstGeom prst="rect">
+                      <a:avLst/>
+                    </a:prstGeom>
+                  </pic:spPr>
+                </pic:pic>
+              </a:graphicData>
+            </a:graphic>
+          </wp:inline>
+        </w:drawing>
+      </w:r>
+    </w:p>
+    <w:p>
+      <w:pPr>
+        <w:spacing w:after="240" w:before="80"/>
+        <w:jc w:val="center"/>
+      </w:pPr>
+      <w:r>
+        <w:rPr>
+          <w:i/>
+          <w:iCs/>
+          <w:color w:val="555555"/>
+          <w:sz w:val="20"/>
+          <w:szCs w:val="20"/>
+        </w:rPr>
+        <w:t xml:space="preserve">Figure 1: Run 1 (original) CNN model comparison, test accuracy (%) across the three fault severities.</w:t>
+      </w:r>
+    </w:p>
+    <w:p>
+      <w:pPr>
+        <w:spacing w:after="120"/>
+      </w:pPr>
+      <w:r>
+        <w:rPr>
+          <w:b/>
+          <w:bCs/>
+        </w:rPr>
+        <w:t xml:space="preserve">Observation: </w:t>
+      </w:r>
+      <w:r>
+        <w:t xml:space="preserve">MobileNetV1 appeared to win clearly. EfficientNetB0, ResNet50, and VGG16 frequently collapsed to exactly 50% accuracy (pure majority-class guessing), suspected to be caused by a preprocessing mismatch -- investigated further below.</w:t>
+      </w:r>
+    </w:p>
+    <w:p>
+      <w:pPr>
+        <w:pStyle w:val="Heading2"/>
+        <w:spacing w:after="150" w:before="300"/>
+      </w:pPr>
+      <w:r>
+        <w:t xml:space="preserve">6.2 Run 2 (Corrected Preprocessing)</w:t>
+      </w:r>
+    </w:p>
+    <w:p>
+      <w:pPr>
+        <w:spacing w:after="160"/>
+      </w:pPr>
+      <w:r>
+        <w:t xml:space="preserve">Each architecture was given its own correct preprocess_input function (e.g. resnet50.preprocess_input, vgg16.preprocess_input, efficientnet.preprocess_input) instead of all models sharing MobileNet's. Every other variable (undersampling, augmentation, early stopping) was kept identical. Results were saved to a separate file so the original run remains available for direct comparison, not overwritten.</w:t>
+      </w:r>
+    </w:p>
+    <w:tbl>
+      <w:tblPr>
+        <w:tblW w:type="dxa" w:w="9360"/>
+        <w:tblBorders>
+          <w:top w:val="single" w:color="auto" w:sz="4"/>
+          <w:left w:val="single" w:color="auto" w:sz="4"/>
+          <w:bottom w:val="single" w:color="auto" w:sz="4"/>
+          <w:right w:val="single" w:color="auto" w:sz="4"/>
+          <w:insideH w:val="single" w:color="auto" w:sz="4"/>
+          <w:insideV w:val="single" w:color="auto" w:sz="4"/>
+        </w:tblBorders>
+      </w:tblPr>
+      <w:tblGrid>
+        <w:gridCol w:w="2300"/>
+        <w:gridCol w:w="1400"/>
+        <w:gridCol w:w="1400"/>
+        <w:gridCol w:w="1400"/>
+        <w:gridCol w:w="1400"/>
+        <w:gridCol w:w="1460"/>
+      </w:tblGrid>
+      <w:tr>
+        <w:tc>
+          <w:tcPr>
+            <w:tcW w:type="dxa" w:w="2300"/>
+            <w:shd w:fill="2F5496" w:color="auto" w:val="clear"/>
+          </w:tcPr>
+          <w:p>
+            <w:r>
+              <w:rPr>
+                <w:b/>
+                <w:bCs/>
+                <w:color w:val="FFFFFF"/>
+              </w:rPr>
+              <w:t xml:space="preserve">Model</w:t>
+            </w:r>
+          </w:p>
+        </w:tc>
+        <w:tc>
+          <w:tcPr>
+            <w:tcW w:type="dxa" w:w="1400"/>
+            <w:shd w:fill="2F5496" w:color="auto" w:val="clear"/>
+          </w:tcPr>
+          <w:p>
+            <w:r>
+              <w:rPr>
+                <w:b/>
+                <w:bCs/>
+                <w:color w:val="FFFFFF"/>
+              </w:rPr>
+              <w:t xml:space="preserve">0.0001s</w:t>
+            </w:r>
+          </w:p>
+        </w:tc>
+        <w:tc>
+          <w:tcPr>
+            <w:tcW w:type="dxa" w:w="1400"/>
+            <w:shd w:fill="2F5496" w:color="auto" w:val="clear"/>
+          </w:tcPr>
+          <w:p>
+            <w:r>
+              <w:rPr>
+                <w:b/>
+                <w:bCs/>
+                <w:color w:val="FFFFFF"/>
+              </w:rPr>
+              <w:t xml:space="preserve">0.005s</w:t>
+            </w:r>
+          </w:p>
+        </w:tc>
+        <w:tc>
+          <w:tcPr>
+            <w:tcW w:type="dxa" w:w="1400"/>
+            <w:shd w:fill="2F5496" w:color="auto" w:val="clear"/>
+          </w:tcPr>
+          <w:p>
+            <w:r>
+              <w:rPr>
+                <w:b/>
+                <w:bCs/>
+                <w:color w:val="FFFFFF"/>
+              </w:rPr>
+              <w:t xml:space="preserve">0.01s</w:t>
+            </w:r>
+          </w:p>
+        </w:tc>
+        <w:tc>
+          <w:tcPr>
+            <w:tcW w:type="dxa" w:w="1400"/>
+            <w:shd w:fill="2F5496" w:color="auto" w:val="clear"/>
+          </w:tcPr>
+          <w:p>
+            <w:r>
+              <w:rPr>
+                <w:b/>
+                <w:bCs/>
+                <w:color w:val="FFFFFF"/>
+              </w:rPr>
+              <w:t xml:space="preserve">Average</w:t>
+            </w:r>
+          </w:p>
+        </w:tc>
+        <w:tc>
+          <w:tcPr>
+            <w:tcW w:type="dxa" w:w="1460"/>
+            <w:shd w:fill="2F5496" w:color="auto" w:val="clear"/>
+          </w:tcPr>
+          <w:p>
+            <w:r>
+              <w:rPr>
+                <w:b/>
+                <w:bCs/>
+                <w:color w:val="FFFFFF"/>
+              </w:rPr>
+              <w:t xml:space="preserve">Change</w:t>
+            </w:r>
+          </w:p>
+        </w:tc>
+      </w:tr>
+      <w:tr>
+        <w:tc>
+          <w:tcPr>
+            <w:tcW w:type="dxa" w:w="2300"/>
+          </w:tcPr>
+          <w:p>
+            <w:r>
+              <w:t xml:space="preserve">EfficientNetB0</w:t>
+            </w:r>
+          </w:p>
+        </w:tc>
+        <w:tc>
+          <w:tcPr>
+            <w:tcW w:type="dxa" w:w="1400"/>
+          </w:tcPr>
+          <w:p>
+            <w:r>
+              <w:t xml:space="preserve">72.9</w:t>
+            </w:r>
+          </w:p>
+        </w:tc>
+        <w:tc>
+          <w:tcPr>
+            <w:tcW w:type="dxa" w:w="1400"/>
+          </w:tcPr>
+          <w:p>
+            <w:r>
+              <w:t xml:space="preserve">75.0</w:t>
+            </w:r>
+          </w:p>
+        </w:tc>
+        <w:tc>
+          <w:tcPr>
+            <w:tcW w:type="dxa" w:w="1400"/>
+          </w:tcPr>
+          <w:p>
+            <w:r>
+              <w:t xml:space="preserve">72.9</w:t>
+            </w:r>
+          </w:p>
+        </w:tc>
+        <w:tc>
+          <w:tcPr>
+            <w:tcW w:type="dxa" w:w="1400"/>
+          </w:tcPr>
+          <w:p>
+            <w:r>
+              <w:t xml:space="preserve">73.6</w:t>
+            </w:r>
+          </w:p>
+        </w:tc>
+        <w:tc>
+          <w:tcPr>
+            <w:tcW w:type="dxa" w:w="1460"/>
+          </w:tcPr>
+          <w:p>
+            <w:r>
+              <w:t xml:space="preserve">+23.6</w:t>
+            </w:r>
+          </w:p>
+        </w:tc>
+      </w:tr>
+      <w:tr>
+        <w:tc>
+          <w:tcPr>
+            <w:tcW w:type="dxa" w:w="2300"/>
+            <w:shd w:fill="F2F2F2" w:color="auto" w:val="clear"/>
+          </w:tcPr>
+          <w:p>
+            <w:r>
+              <w:t xml:space="preserve">MobileNetV1</w:t>
+            </w:r>
+          </w:p>
+        </w:tc>
+        <w:tc>
+          <w:tcPr>
+            <w:tcW w:type="dxa" w:w="1400"/>
+            <w:shd w:fill="F2F2F2" w:color="auto" w:val="clear"/>
+          </w:tcPr>
+          <w:p>
+            <w:r>
+              <w:t xml:space="preserve">66.7</w:t>
+            </w:r>
+          </w:p>
+        </w:tc>
+        <w:tc>
+          <w:tcPr>
+            <w:tcW w:type="dxa" w:w="1400"/>
+            <w:shd w:fill="F2F2F2" w:color="auto" w:val="clear"/>
+          </w:tcPr>
+          <w:p>
+            <w:r>
+              <w:t xml:space="preserve">70.8</w:t>
+            </w:r>
+          </w:p>
+        </w:tc>
+        <w:tc>
+          <w:tcPr>
+            <w:tcW w:type="dxa" w:w="1400"/>
+            <w:shd w:fill="F2F2F2" w:color="auto" w:val="clear"/>
+          </w:tcPr>
+          <w:p>
+            <w:r>
+              <w:t xml:space="preserve">66.7</w:t>
+            </w:r>
+          </w:p>
+        </w:tc>
+        <w:tc>
+          <w:tcPr>
+            <w:tcW w:type="dxa" w:w="1400"/>
+            <w:shd w:fill="F2F2F2" w:color="auto" w:val="clear"/>
+          </w:tcPr>
+          <w:p>
+            <w:r>
+              <w:t xml:space="preserve">68.1</w:t>
+            </w:r>
+          </w:p>
+        </w:tc>
+        <w:tc>
+          <w:tcPr>
+            <w:tcW w:type="dxa" w:w="1460"/>
+            <w:shd w:fill="F2F2F2" w:color="auto" w:val="clear"/>
+          </w:tcPr>
+          <w:p>
+            <w:r>
+              <w:t xml:space="preserve">-6.2</w:t>
+            </w:r>
+          </w:p>
+        </w:tc>
+      </w:tr>
+      <w:tr>
+        <w:tc>
+          <w:tcPr>
+            <w:tcW w:type="dxa" w:w="2300"/>
+          </w:tcPr>
+          <w:p>
+            <w:r>
+              <w:t xml:space="preserve">ResNet50</w:t>
+            </w:r>
+          </w:p>
+        </w:tc>
+        <w:tc>
+          <w:tcPr>
+            <w:tcW w:type="dxa" w:w="1400"/>
+          </w:tcPr>
+          <w:p>
+            <w:r>
+              <w:t xml:space="preserve">62.5</w:t>
+            </w:r>
+          </w:p>
+        </w:tc>
+        <w:tc>
+          <w:tcPr>
+            <w:tcW w:type="dxa" w:w="1400"/>
+          </w:tcPr>
+          <w:p>
+            <w:r>
+              <w:t xml:space="preserve">68.8</w:t>
+            </w:r>
+          </w:p>
+        </w:tc>
+        <w:tc>
+          <w:tcPr>
+            <w:tcW w:type="dxa" w:w="1400"/>
+          </w:tcPr>
+          <w:p>
+            <w:r>
+              <w:t xml:space="preserve">68.8</w:t>
+            </w:r>
+          </w:p>
+        </w:tc>
+        <w:tc>
+          <w:tcPr>
+            <w:tcW w:type="dxa" w:w="1400"/>
+          </w:tcPr>
+          <w:p>
+            <w:r>
+              <w:t xml:space="preserve">66.7</w:t>
+            </w:r>
+          </w:p>
+        </w:tc>
+        <w:tc>
+          <w:tcPr>
+            <w:tcW w:type="dxa" w:w="1460"/>
+          </w:tcPr>
+          <w:p>
+            <w:r>
+              <w:t xml:space="preserve">+9.8</w:t>
+            </w:r>
+          </w:p>
+        </w:tc>
+      </w:tr>
+      <w:tr>
+        <w:tc>
+          <w:tcPr>
+            <w:tcW w:type="dxa" w:w="2300"/>
+            <w:shd w:fill="F2F2F2" w:color="auto" w:val="clear"/>
+          </w:tcPr>
+          <w:p>
+            <w:r>
+              <w:t xml:space="preserve">InceptionV3</w:t>
+            </w:r>
+          </w:p>
+        </w:tc>
+        <w:tc>
+          <w:tcPr>
+            <w:tcW w:type="dxa" w:w="1400"/>
+            <w:shd w:fill="F2F2F2" w:color="auto" w:val="clear"/>
+          </w:tcPr>
+          <w:p>
+            <w:r>
+              <w:t xml:space="preserve">66.7</w:t>
+            </w:r>
+          </w:p>
+        </w:tc>
+        <w:tc>
+          <w:tcPr>
+            <w:tcW w:type="dxa" w:w="1400"/>
+            <w:shd w:fill="F2F2F2" w:color="auto" w:val="clear"/>
+          </w:tcPr>
+          <w:p>
+            <w:r>
+              <w:t xml:space="preserve">68.8</w:t>
+            </w:r>
+          </w:p>
+        </w:tc>
+        <w:tc>
+          <w:tcPr>
+            <w:tcW w:type="dxa" w:w="1400"/>
+            <w:shd w:fill="F2F2F2" w:color="auto" w:val="clear"/>
+          </w:tcPr>
+          <w:p>
+            <w:r>
+              <w:t xml:space="preserve">64.6</w:t>
+            </w:r>
+          </w:p>
+        </w:tc>
+        <w:tc>
+          <w:tcPr>
+            <w:tcW w:type="dxa" w:w="1400"/>
+            <w:shd w:fill="F2F2F2" w:color="auto" w:val="clear"/>
+          </w:tcPr>
+          <w:p>
+            <w:r>
+              <w:t xml:space="preserve">66.7</w:t>
+            </w:r>
+          </w:p>
+        </w:tc>
+        <w:tc>
+          <w:tcPr>
+            <w:tcW w:type="dxa" w:w="1460"/>
+            <w:shd w:fill="F2F2F2" w:color="auto" w:val="clear"/>
+          </w:tcPr>
+          <w:p>
+            <w:r>
+              <w:t xml:space="preserve">0.0</w:t>
+            </w:r>
+          </w:p>
+        </w:tc>
+      </w:tr>
+      <w:tr>
+        <w:tc>
+          <w:tcPr>
+            <w:tcW w:type="dxa" w:w="2300"/>
+          </w:tcPr>
+          <w:p>
+            <w:r>
+              <w:t xml:space="preserve">VGG16</w:t>
+            </w:r>
+          </w:p>
+        </w:tc>
+        <w:tc>
+          <w:tcPr>
+            <w:tcW w:type="dxa" w:w="1400"/>
+          </w:tcPr>
+          <w:p>
+            <w:r>
+              <w:t xml:space="preserve">68.8</w:t>
+            </w:r>
+          </w:p>
+        </w:tc>
+        <w:tc>
+          <w:tcPr>
+            <w:tcW w:type="dxa" w:w="1400"/>
+          </w:tcPr>
+          <w:p>
+            <w:r>
+              <w:t xml:space="preserve">68.8</w:t>
+            </w:r>
+          </w:p>
+        </w:tc>
+        <w:tc>
+          <w:tcPr>
+            <w:tcW w:type="dxa" w:w="1400"/>
+          </w:tcPr>
+          <w:p>
+            <w:r>
+              <w:t xml:space="preserve">60.4</w:t>
+            </w:r>
+          </w:p>
+        </w:tc>
+        <w:tc>
+          <w:tcPr>
+            <w:tcW w:type="dxa" w:w="1400"/>
+          </w:tcPr>
+          <w:p>
+            <w:r>
+              <w:t xml:space="preserve">66.0</w:t>
+            </w:r>
+          </w:p>
+        </w:tc>
+        <w:tc>
+          <w:tcPr>
+            <w:tcW w:type="dxa" w:w="1460"/>
+          </w:tcPr>
+          <w:p>
+            <w:r>
+              <w:t xml:space="preserve">+6.3</w:t>
+            </w:r>
+          </w:p>
+        </w:tc>
+      </w:tr>
+      <w:tr>
+        <w:tc>
+          <w:tcPr>
+            <w:tcW w:type="dxa" w:w="2300"/>
+            <w:shd w:fill="F2F2F2" w:color="auto" w:val="clear"/>
+          </w:tcPr>
+          <w:p>
+            <w:r>
+              <w:t xml:space="preserve">DenseNet121</w:t>
+            </w:r>
+          </w:p>
+        </w:tc>
+        <w:tc>
+          <w:tcPr>
+            <w:tcW w:type="dxa" w:w="1400"/>
+            <w:shd w:fill="F2F2F2" w:color="auto" w:val="clear"/>
+          </w:tcPr>
+          <w:p>
+            <w:r>
+              <w:t xml:space="preserve">54.2</w:t>
+            </w:r>
+          </w:p>
+        </w:tc>
+        <w:tc>
+          <w:tcPr>
+            <w:tcW w:type="dxa" w:w="1400"/>
+            <w:shd w:fill="F2F2F2" w:color="auto" w:val="clear"/>
+          </w:tcPr>
+          <w:p>
+            <w:r>
+              <w:t xml:space="preserve">70.8</w:t>
+            </w:r>
+          </w:p>
+        </w:tc>
+        <w:tc>
+          <w:tcPr>
+            <w:tcW w:type="dxa" w:w="1400"/>
+            <w:shd w:fill="F2F2F2" w:color="auto" w:val="clear"/>
+          </w:tcPr>
+          <w:p>
+            <w:r>
+              <w:t xml:space="preserve">68.8</w:t>
+            </w:r>
+          </w:p>
+        </w:tc>
+        <w:tc>
+          <w:tcPr>
+            <w:tcW w:type="dxa" w:w="1400"/>
+            <w:shd w:fill="F2F2F2" w:color="auto" w:val="clear"/>
+          </w:tcPr>
+          <w:p>
+            <w:r>
+              <w:t xml:space="preserve">64.6</w:t>
+            </w:r>
+          </w:p>
+        </w:tc>
+        <w:tc>
+          <w:tcPr>
+            <w:tcW w:type="dxa" w:w="1460"/>
+            <w:shd w:fill="F2F2F2" w:color="auto" w:val="clear"/>
+          </w:tcPr>
+          <w:p>
+            <w:r>
+              <w:t xml:space="preserve">+2.8</w:t>
+            </w:r>
+          </w:p>
+        </w:tc>
+      </w:tr>
+      <w:tr>
+        <w:tc>
+          <w:tcPr>
+            <w:tcW w:type="dxa" w:w="2300"/>
+          </w:tcPr>
+          <w:p>
+            <w:r>
+              <w:t xml:space="preserve">Xception</w:t>
+            </w:r>
+          </w:p>
+        </w:tc>
+        <w:tc>
+          <w:tcPr>
+            <w:tcW w:type="dxa" w:w="1400"/>
+          </w:tcPr>
+          <w:p>
+            <w:r>
+              <w:t xml:space="preserve">52.1</w:t>
+            </w:r>
+          </w:p>
+        </w:tc>
+        <w:tc>
+          <w:tcPr>
+            <w:tcW w:type="dxa" w:w="1400"/>
+          </w:tcPr>
+          <w:p>
+            <w:r>
+              <w:t xml:space="preserve">70.8</w:t>
+            </w:r>
+          </w:p>
+        </w:tc>
+        <w:tc>
+          <w:tcPr>
+            <w:tcW w:type="dxa" w:w="1400"/>
+          </w:tcPr>
+          <w:p>
+            <w:r>
+              <w:t xml:space="preserve">62.5</w:t>
+            </w:r>
+          </w:p>
+        </w:tc>
+        <w:tc>
+          <w:tcPr>
+            <w:tcW w:type="dxa" w:w="1400"/>
+          </w:tcPr>
+          <w:p>
+            <w:r>
+              <w:t xml:space="preserve">61.8</w:t>
+            </w:r>
+          </w:p>
+        </w:tc>
+        <w:tc>
+          <w:tcPr>
+            <w:tcW w:type="dxa" w:w="1460"/>
+          </w:tcPr>
+          <w:p>
+            <w:r>
+              <w:t xml:space="preserve">-3.5</w:t>
+            </w:r>
+          </w:p>
+        </w:tc>
+      </w:tr>
+      <w:tr>
+        <w:tc>
+          <w:tcPr>
+            <w:tcW w:type="dxa" w:w="2300"/>
+            <w:shd w:fill="F2F2F2" w:color="auto" w:val="clear"/>
+          </w:tcPr>
+          <w:p>
+            <w:r>
+              <w:t xml:space="preserve">MobileNetV2</w:t>
+            </w:r>
+          </w:p>
+        </w:tc>
+        <w:tc>
+          <w:tcPr>
+            <w:tcW w:type="dxa" w:w="1400"/>
+            <w:shd w:fill="F2F2F2" w:color="auto" w:val="clear"/>
+          </w:tcPr>
+          <w:p>
+            <w:r>
+              <w:t xml:space="preserve">54.2</w:t>
+            </w:r>
+          </w:p>
+        </w:tc>
+        <w:tc>
+          <w:tcPr>
+            <w:tcW w:type="dxa" w:w="1400"/>
+            <w:shd w:fill="F2F2F2" w:color="auto" w:val="clear"/>
+          </w:tcPr>
+          <w:p>
+            <w:r>
+              <w:t xml:space="preserve">64.6</w:t>
+            </w:r>
+          </w:p>
+        </w:tc>
+        <w:tc>
+          <w:tcPr>
+            <w:tcW w:type="dxa" w:w="1400"/>
+            <w:shd w:fill="F2F2F2" w:color="auto" w:val="clear"/>
+          </w:tcPr>
+          <w:p>
+            <w:r>
+              <w:t xml:space="preserve">47.9</w:t>
+            </w:r>
+          </w:p>
+        </w:tc>
+        <w:tc>
+          <w:tcPr>
+            <w:tcW w:type="dxa" w:w="1400"/>
+            <w:shd w:fill="F2F2F2" w:color="auto" w:val="clear"/>
+          </w:tcPr>
+          <w:p>
+            <w:r>
+              <w:t xml:space="preserve">55.6</w:t>
+            </w:r>
+          </w:p>
+        </w:tc>
+        <w:tc>
+          <w:tcPr>
+            <w:tcW w:type="dxa" w:w="1460"/>
+            <w:shd w:fill="F2F2F2" w:color="auto" w:val="clear"/>
+          </w:tcPr>
+          <w:p>
+            <w:r>
+              <w:t xml:space="preserve">-4.1</w:t>
+            </w:r>
+          </w:p>
+        </w:tc>
+      </w:tr>
+    </w:tbl>
+    <w:p>
+      <w:pPr>
+        <w:spacing w:after="160"/>
+      </w:pPr>
+      <w:r>
+        <w:t xml:space="preserve"/>
+      </w:r>
+    </w:p>
+    <w:p>
+      <w:pPr>
         <w:spacing w:after="120"/>
       </w:pPr>
       <w:r>
@@ -1098,7 +1870,7 @@
         <w:t xml:space="preserve">Key finding: </w:t>
       </w:r>
       <w:r>
-        <w:t xml:space="preserve">MobileNetV1 was both the most accurate (74.3% average) and by far the most computationally efficient model, training in under 90 seconds per run versus 200-800+ seconds for larger architectures.</w:t>
+        <w:t xml:space="preserve">the preprocessing theory was confirmed dramatically for EfficientNetB0 -- it moved from complete class collapse (50.0%, always predicting "fault") to the single best-performing architecture overall (73.6%), a +23.6 point improvement from fixing preprocessing alone. ResNet50 (+9.8) and VGG16 (+6.3) also improved meaningfully, consistent with the hypothesis.</w:t>
       </w:r>
     </w:p>
     <w:p>
@@ -1110,10 +1882,25 @@
           <w:b/>
           <w:bCs/>
         </w:rPr>
-        <w:t xml:space="preserve">Secondary finding: </w:t>
-      </w:r>
-      <w:r>
-        <w:t xml:space="preserve">EfficientNetB0, ResNet50, and VGG16 frequently collapsed to predicting a single class (exactly 50% accuracy). This was traced to a preprocessing mismatch inherited from the reference implementation: all models were fed images normalized specifically for MobileNet, rather than each architecture's own expected input normalization - likely undervaluing these architectures' true capability.</w:t>
+        <w:t xml:space="preserve">On MobileNetV1's small drop: </w:t>
+      </w:r>
+      <w:r>
+        <w:t xml:space="preserve">its preprocessing never changed between runs, so the 74.3% to 68.1% shift is attributed to ordinary run-to-run variance from the random undersampling step (only 120 of ~715+ available fault images are sampled each run) rather than a real regression.</w:t>
+      </w:r>
+    </w:p>
+    <w:p>
+      <w:pPr>
+        <w:spacing w:after="120"/>
+      </w:pPr>
+      <w:r>
+        <w:rPr>
+          <w:b/>
+          <w:bCs/>
+        </w:rPr>
+        <w:t xml:space="preserve">Revised conclusion: </w:t>
+      </w:r>
+      <w:r>
+        <w:t xml:space="preserve">the original "MobileNetV1 wins clearly" finding was itself partly an artifact of the preprocessing bug. With it corrected, EfficientNetB0 and MobileNetV1 emerge as the two strongest architectures, both meaningfully ahead of the rest. Both runs are preserved as a demonstration of investigating a surprising result rather than accepting it at face value.</w:t>
       </w:r>
     </w:p>
     <w:p>
@@ -1545,6 +2332,68 @@
     </w:p>
     <w:p>
       <w:pPr>
+        <w:spacing w:after="40" w:before="120"/>
+        <w:jc w:val="center"/>
+      </w:pPr>
+      <w:r>
+        <w:drawing>
+          <wp:inline distT="0" distB="0" distL="0" distR="0">
+            <wp:extent cx="4191000" cy="1247775"/>
+            <wp:effectExtent t="0" r="0" b="0" l="0"/>
+            <wp:docPr id="1" name="" descr="" title=""/>
+            <wp:cNvGraphicFramePr>
+              <a:graphicFrameLocks xmlns:a="http://schemas.openxmlformats.org/drawingml/2006/main" noChangeAspect="1"/>
+            </wp:cNvGraphicFramePr>
+            <a:graphic xmlns:a="http://schemas.openxmlformats.org/drawingml/2006/main">
+              <a:graphicData uri="http://schemas.openxmlformats.org/drawingml/2006/picture">
+                <pic:pic xmlns:pic="http://schemas.openxmlformats.org/drawingml/2006/picture">
+                  <pic:nvPicPr>
+                    <pic:cNvPr id="0" name="" descr=""/>
+                    <pic:cNvPicPr>
+                      <a:picLocks noChangeAspect="1" noChangeArrowheads="1"/>
+                    </pic:cNvPicPr>
+                  </pic:nvPicPr>
+                  <pic:blipFill>
+                    <a:blip r:embed="rId8" cstate="none"/>
+                    <a:srcRect/>
+                    <a:stretch>
+                      <a:fillRect/>
+                    </a:stretch>
+                  </pic:blipFill>
+                  <pic:spPr bwMode="auto">
+                    <a:xfrm>
+                      <a:off x="0" y="0"/>
+                      <a:ext cx="4191000" cy="1247775"/>
+                    </a:xfrm>
+                    <a:prstGeom prst="rect">
+                      <a:avLst/>
+                    </a:prstGeom>
+                  </pic:spPr>
+                </pic:pic>
+              </a:graphicData>
+            </a:graphic>
+          </wp:inline>
+        </w:drawing>
+      </w:r>
+    </w:p>
+    <w:p>
+      <w:pPr>
+        <w:spacing w:after="240" w:before="80"/>
+        <w:jc w:val="center"/>
+      </w:pPr>
+      <w:r>
+        <w:rPr>
+          <w:i/>
+          <w:iCs/>
+          <w:color w:val="555555"/>
+          <w:sz w:val="20"/>
+          <w:szCs w:val="20"/>
+        </w:rPr>
+        <w:t xml:space="preserve">Figure 2: Phase-reconstruction accuracy (normalized RMSE and correlation) versus fault severity.</w:t>
+      </w:r>
+    </w:p>
+    <w:p>
+      <w:pPr>
         <w:spacing w:after="160"/>
       </w:pPr>
       <w:r>
@@ -1595,7 +2444,7 @@
         <w:spacing w:after="100"/>
       </w:pPr>
       <w:r>
-        <w:t xml:space="preserve">Small dataset per condition for the CNN comparison (~240 images after balancing).</w:t>
+        <w:t xml:space="preserve">Small dataset per condition for the CNN comparison (~240 images after balancing) -- causes some run-to-run variance from random undersampling, visible when comparing Run 1 and Run 2 results.</w:t>
       </w:r>
     </w:p>
     <w:p>
@@ -1608,7 +2457,7 @@
         <w:spacing w:after="100"/>
       </w:pPr>
       <w:r>
-        <w:t xml:space="preserve">Preprocessing was not corrected per-architecture for the 3 underperforming CNN models (see Section 6).</w:t>
+        <w:t xml:space="preserve">Random undersampling discarded a majority of available fault images to achieve class balance.</w:t>
       </w:r>
     </w:p>
     <w:p>
@@ -1621,7 +2470,7 @@
         <w:spacing w:after="100"/>
       </w:pPr>
       <w:r>
-        <w:t xml:space="preserve">Random undersampling discarded a majority of available fault images to achieve class balance.</w:t>
+        <w:t xml:space="preserve">All training and analysis was performed on CPU only.</w:t>
       </w:r>
     </w:p>
     <w:p>
@@ -1634,7 +2483,7 @@
         <w:spacing w:after="100"/>
       </w:pPr>
       <w:r>
-        <w:t xml:space="preserve">All training and analysis was performed on CPU only.</w:t>
+        <w:t xml:space="preserve">The corrected run (Section 6.2) fixes input preprocessing but does not explore other architecture-specific tuning (e.g. native input resolution, unfreezing later layers).</w:t>
       </w:r>
     </w:p>
     <w:p>
@@ -1664,7 +2513,7 @@
         <w:spacing w:after="160"/>
       </w:pPr>
       <w:r>
-        <w:t xml:space="preserve">This project successfully adapted a published reference AI pipeline to a real IEEE-published BLDC motor fault dataset, diagnosing and correcting genuine environment-setup and data-imbalance obstacles along the way. The resulting comparison identified MobileNetV1 as the most accurate and efficient model for Hall-sensor fault detection, achieving 74.3% average test accuracy under a properly balanced, non-inflated evaluation methodology.</w:t>
+        <w:t xml:space="preserve">This project successfully adapted a published reference AI pipeline to a real IEEE-published BLDC motor fault dataset, diagnosing and correcting genuine environment-setup, data-imbalance, and preprocessing obstacles along the way. The comparison was run twice: an original pass that appeared to show MobileNetV1 as a clear winner, and a corrected pass with proper per-model preprocessing that revealed EfficientNetB0 and MobileNetV1 as the two strongest architectures, with EfficientNetB0 improving by 23.6 percentage points once its preprocessing was fixed. Both runs are preserved for direct comparison, illustrating the value of investigating a surprising result rather than reporting it at face value.</w:t>
       </w:r>
     </w:p>
     <w:p>
@@ -1672,7 +2521,7 @@
         <w:spacing w:after="160"/>
       </w:pPr>
       <w:r>
-        <w:t xml:space="preserve">A supplementary investigation into single-sensor reconstruction produced a clear, well-evidenced negative result for its original purpose, while uncovering a promising secondary application: reconstruction error as a simple, low-cost fault indicator. Together, these two pieces of work represent a complete investigation - a working, comparative AI system, and a rigorously tested engineering hypothesis with an honest, data-backed conclusion.</w:t>
+        <w:t xml:space="preserve">A supplementary investigation into single-sensor reconstruction produced a clear, well-evidenced negative result for its original purpose, while uncovering a promising secondary application: reconstruction error as a simple, low-cost fault indicator. Together, these pieces represent a complete investigation - a working, comparative AI system refined through genuine debugging, and a rigorously tested engineering hypothesis with an honest, data-backed conclusion.</w:t>
       </w:r>
     </w:p>
     <w:sectPr>

</xml_diff>